<commit_message>
fix(dme): preserve scenario settings and validate applied targets [verified]
</commit_message>
<xml_diff>
--- a/public/templates/ai-scenario-dme-1119a.docx
+++ b/public/templates/ai-scenario-dme-1119a.docx
@@ -1440,6 +1440,922 @@
         <w:pStyle w:val="Heading2"/>
       </w:pPr>
       <w:r>
+        <w:t>RMS limit enables</w:t>
+      </w:r>
+    </w:p>
+    <w:tbl>
+      <w:tblPr>
+        <w:tblStyle w:val="TableGrid"/>
+        <w:tblW w:type="auto" w:w="0"/>
+        <w:tblLayout w:type="fixed"/>
+        <w:tblLook w:firstColumn="1" w:firstRow="1" w:lastColumn="0" w:lastRow="0" w:noHBand="0" w:noVBand="1" w:val="04A0"/>
+      </w:tblPr>
+      <w:tblGrid>
+        <w:gridCol w:w="5472"/>
+        <w:gridCol w:w="1656"/>
+        <w:gridCol w:w="2736"/>
+      </w:tblGrid>
+      <w:tr>
+        <w:trPr>
+          <w:tblHeader/>
+        </w:trPr>
+        <w:tc>
+          <w:tcPr>
+            <w:tcW w:type="dxa" w:w="5472"/>
+          </w:tcPr>
+          <w:p>
+            <w:r>
+              <w:rPr>
+                <w:b/>
+              </w:rPr>
+              <w:t>Thông số / đơn vị / giới hạn</w:t>
+            </w:r>
+          </w:p>
+        </w:tc>
+        <w:tc>
+          <w:tcPr>
+            <w:tcW w:type="dxa" w:w="1656"/>
+          </w:tcPr>
+          <w:p>
+            <w:r>
+              <w:rPr>
+                <w:b/>
+              </w:rPr>
+              <w:t>Mặc định mô phỏng</w:t>
+            </w:r>
+          </w:p>
+        </w:tc>
+        <w:tc>
+          <w:tcPr>
+            <w:tcW w:type="dxa" w:w="2736"/>
+          </w:tcPr>
+          <w:p>
+            <w:r>
+              <w:rPr>
+                <w:b/>
+              </w:rPr>
+              <w:t>Giá trị tài liệu / Nguồn/trang</w:t>
+            </w:r>
+          </w:p>
+        </w:tc>
+      </w:tr>
+      <w:tr>
+        <w:tc>
+          <w:p>
+            <w:r>
+              <w:t>RMS voltage limit 1 enabled · Bật / Tắt</w:t>
+            </w:r>
+          </w:p>
+        </w:tc>
+        <w:tc>
+          <w:p>
+            <w:r>
+              <w:t>Tắt</w:t>
+            </w:r>
+          </w:p>
+        </w:tc>
+        <w:tc>
+          <w:p>
+            <w:r>
+              <w:t>Giá trị: ______; Nguồn/trang: ______</w:t>
+            </w:r>
+          </w:p>
+        </w:tc>
+      </w:tr>
+      <w:tr>
+        <w:tc>
+          <w:p>
+            <w:r>
+              <w:t>RMS voltage limit 2 enabled · Bật / Tắt</w:t>
+            </w:r>
+          </w:p>
+        </w:tc>
+        <w:tc>
+          <w:p>
+            <w:r>
+              <w:t>Tắt</w:t>
+            </w:r>
+          </w:p>
+        </w:tc>
+        <w:tc>
+          <w:p>
+            <w:r>
+              <w:t>Giá trị: ______; Nguồn/trang: ______</w:t>
+            </w:r>
+          </w:p>
+        </w:tc>
+      </w:tr>
+      <w:tr>
+        <w:tc>
+          <w:p>
+            <w:r>
+              <w:t>RMS voltage limit 3 enabled · Bật / Tắt</w:t>
+            </w:r>
+          </w:p>
+        </w:tc>
+        <w:tc>
+          <w:p>
+            <w:r>
+              <w:t>Tắt</w:t>
+            </w:r>
+          </w:p>
+        </w:tc>
+        <w:tc>
+          <w:p>
+            <w:r>
+              <w:t>Giá trị: ______; Nguồn/trang: ______</w:t>
+            </w:r>
+          </w:p>
+        </w:tc>
+      </w:tr>
+      <w:tr>
+        <w:tc>
+          <w:p>
+            <w:r>
+              <w:t>RMS voltage limit 4 enabled · Bật / Tắt</w:t>
+            </w:r>
+          </w:p>
+        </w:tc>
+        <w:tc>
+          <w:p>
+            <w:r>
+              <w:t>Tắt</w:t>
+            </w:r>
+          </w:p>
+        </w:tc>
+        <w:tc>
+          <w:p>
+            <w:r>
+              <w:t>Giá trị: ______; Nguồn/trang: ______</w:t>
+            </w:r>
+          </w:p>
+        </w:tc>
+      </w:tr>
+      <w:tr>
+        <w:tc>
+          <w:p>
+            <w:r>
+              <w:t>RMS voltage limit 5 enabled · Bật / Tắt</w:t>
+            </w:r>
+          </w:p>
+        </w:tc>
+        <w:tc>
+          <w:p>
+            <w:r>
+              <w:t>Tắt</w:t>
+            </w:r>
+          </w:p>
+        </w:tc>
+        <w:tc>
+          <w:p>
+            <w:r>
+              <w:t>Giá trị: ______; Nguồn/trang: ______</w:t>
+            </w:r>
+          </w:p>
+        </w:tc>
+      </w:tr>
+      <w:tr>
+        <w:tc>
+          <w:p>
+            <w:r>
+              <w:t>RMS voltage limit 6 enabled · Bật / Tắt</w:t>
+            </w:r>
+          </w:p>
+        </w:tc>
+        <w:tc>
+          <w:p>
+            <w:r>
+              <w:t>Tắt</w:t>
+            </w:r>
+          </w:p>
+        </w:tc>
+        <w:tc>
+          <w:p>
+            <w:r>
+              <w:t>Giá trị: ______; Nguồn/trang: ______</w:t>
+            </w:r>
+          </w:p>
+        </w:tc>
+      </w:tr>
+      <w:tr>
+        <w:tc>
+          <w:p>
+            <w:r>
+              <w:t>RMS voltage limit 7 enabled · Bật / Tắt</w:t>
+            </w:r>
+          </w:p>
+        </w:tc>
+        <w:tc>
+          <w:p>
+            <w:r>
+              <w:t>Tắt</w:t>
+            </w:r>
+          </w:p>
+        </w:tc>
+        <w:tc>
+          <w:p>
+            <w:r>
+              <w:t>Giá trị: ______; Nguồn/trang: ______</w:t>
+            </w:r>
+          </w:p>
+        </w:tc>
+      </w:tr>
+      <w:tr>
+        <w:tc>
+          <w:p>
+            <w:r>
+              <w:t>RMS voltage limit 8 enabled · Bật / Tắt</w:t>
+            </w:r>
+          </w:p>
+        </w:tc>
+        <w:tc>
+          <w:p>
+            <w:r>
+              <w:t>Tắt</w:t>
+            </w:r>
+          </w:p>
+        </w:tc>
+        <w:tc>
+          <w:p>
+            <w:r>
+              <w:t>Giá trị: ______; Nguồn/trang: ______</w:t>
+            </w:r>
+          </w:p>
+        </w:tc>
+      </w:tr>
+      <w:tr>
+        <w:tc>
+          <w:p>
+            <w:r>
+              <w:t>RMS voltage limit 9 enabled · Bật / Tắt</w:t>
+            </w:r>
+          </w:p>
+        </w:tc>
+        <w:tc>
+          <w:p>
+            <w:r>
+              <w:t>Tắt</w:t>
+            </w:r>
+          </w:p>
+        </w:tc>
+        <w:tc>
+          <w:p>
+            <w:r>
+              <w:t>Giá trị: ______; Nguồn/trang: ______</w:t>
+            </w:r>
+          </w:p>
+        </w:tc>
+      </w:tr>
+      <w:tr>
+        <w:tc>
+          <w:p>
+            <w:r>
+              <w:t>RMS voltage limit 10 enabled · Bật / Tắt</w:t>
+            </w:r>
+          </w:p>
+        </w:tc>
+        <w:tc>
+          <w:p>
+            <w:r>
+              <w:t>Tắt</w:t>
+            </w:r>
+          </w:p>
+        </w:tc>
+        <w:tc>
+          <w:p>
+            <w:r>
+              <w:t>Giá trị: ______; Nguồn/trang: ______</w:t>
+            </w:r>
+          </w:p>
+        </w:tc>
+      </w:tr>
+      <w:tr>
+        <w:tc>
+          <w:p>
+            <w:r>
+              <w:t>RMS voltage limit 11 enabled · Bật / Tắt</w:t>
+            </w:r>
+          </w:p>
+        </w:tc>
+        <w:tc>
+          <w:p>
+            <w:r>
+              <w:t>Tắt</w:t>
+            </w:r>
+          </w:p>
+        </w:tc>
+        <w:tc>
+          <w:p>
+            <w:r>
+              <w:t>Giá trị: ______; Nguồn/trang: ______</w:t>
+            </w:r>
+          </w:p>
+        </w:tc>
+      </w:tr>
+      <w:tr>
+        <w:tc>
+          <w:p>
+            <w:r>
+              <w:t>RMS voltage limit 12 enabled · Bật / Tắt</w:t>
+            </w:r>
+          </w:p>
+        </w:tc>
+        <w:tc>
+          <w:p>
+            <w:r>
+              <w:t>Tắt</w:t>
+            </w:r>
+          </w:p>
+        </w:tc>
+        <w:tc>
+          <w:p>
+            <w:r>
+              <w:t>Giá trị: ______; Nguồn/trang: ______</w:t>
+            </w:r>
+          </w:p>
+        </w:tc>
+      </w:tr>
+      <w:tr>
+        <w:tc>
+          <w:p>
+            <w:r>
+              <w:t>RMS voltage limit 13 enabled · Bật / Tắt</w:t>
+            </w:r>
+          </w:p>
+        </w:tc>
+        <w:tc>
+          <w:p>
+            <w:r>
+              <w:t>Tắt</w:t>
+            </w:r>
+          </w:p>
+        </w:tc>
+        <w:tc>
+          <w:p>
+            <w:r>
+              <w:t>Giá trị: ______; Nguồn/trang: ______</w:t>
+            </w:r>
+          </w:p>
+        </w:tc>
+      </w:tr>
+      <w:tr>
+        <w:tc>
+          <w:p>
+            <w:r>
+              <w:t>RMS voltage limit 14 enabled · Bật / Tắt</w:t>
+            </w:r>
+          </w:p>
+        </w:tc>
+        <w:tc>
+          <w:p>
+            <w:r>
+              <w:t>Tắt</w:t>
+            </w:r>
+          </w:p>
+        </w:tc>
+        <w:tc>
+          <w:p>
+            <w:r>
+              <w:t>Giá trị: ______; Nguồn/trang: ______</w:t>
+            </w:r>
+          </w:p>
+        </w:tc>
+      </w:tr>
+      <w:tr>
+        <w:tc>
+          <w:p>
+            <w:r>
+              <w:t>RMS voltage limit 15 enabled · Bật / Tắt</w:t>
+            </w:r>
+          </w:p>
+        </w:tc>
+        <w:tc>
+          <w:p>
+            <w:r>
+              <w:t>Tắt</w:t>
+            </w:r>
+          </w:p>
+        </w:tc>
+        <w:tc>
+          <w:p>
+            <w:r>
+              <w:t>Giá trị: ______; Nguồn/trang: ______</w:t>
+            </w:r>
+          </w:p>
+        </w:tc>
+      </w:tr>
+      <w:tr>
+        <w:tc>
+          <w:p>
+            <w:r>
+              <w:t>RMS current limit 1 enabled · Bật / Tắt</w:t>
+            </w:r>
+          </w:p>
+        </w:tc>
+        <w:tc>
+          <w:p>
+            <w:r>
+              <w:t>Tắt</w:t>
+            </w:r>
+          </w:p>
+        </w:tc>
+        <w:tc>
+          <w:p>
+            <w:r>
+              <w:t>Giá trị: ______; Nguồn/trang: ______</w:t>
+            </w:r>
+          </w:p>
+        </w:tc>
+      </w:tr>
+      <w:tr>
+        <w:tc>
+          <w:p>
+            <w:r>
+              <w:t>RMS current limit 2 enabled · Bật / Tắt</w:t>
+            </w:r>
+          </w:p>
+        </w:tc>
+        <w:tc>
+          <w:p>
+            <w:r>
+              <w:t>Tắt</w:t>
+            </w:r>
+          </w:p>
+        </w:tc>
+        <w:tc>
+          <w:p>
+            <w:r>
+              <w:t>Giá trị: ______; Nguồn/trang: ______</w:t>
+            </w:r>
+          </w:p>
+        </w:tc>
+      </w:tr>
+      <w:tr>
+        <w:tc>
+          <w:p>
+            <w:r>
+              <w:t>RMS current limit 3 enabled · Bật / Tắt</w:t>
+            </w:r>
+          </w:p>
+        </w:tc>
+        <w:tc>
+          <w:p>
+            <w:r>
+              <w:t>Tắt</w:t>
+            </w:r>
+          </w:p>
+        </w:tc>
+        <w:tc>
+          <w:p>
+            <w:r>
+              <w:t>Giá trị: ______; Nguồn/trang: ______</w:t>
+            </w:r>
+          </w:p>
+        </w:tc>
+      </w:tr>
+      <w:tr>
+        <w:tc>
+          <w:p>
+            <w:r>
+              <w:t>RMS current limit 4 enabled · Bật / Tắt</w:t>
+            </w:r>
+          </w:p>
+        </w:tc>
+        <w:tc>
+          <w:p>
+            <w:r>
+              <w:t>Tắt</w:t>
+            </w:r>
+          </w:p>
+        </w:tc>
+        <w:tc>
+          <w:p>
+            <w:r>
+              <w:t>Giá trị: ______; Nguồn/trang: ______</w:t>
+            </w:r>
+          </w:p>
+        </w:tc>
+      </w:tr>
+      <w:tr>
+        <w:tc>
+          <w:p>
+            <w:r>
+              <w:t>RMS current limit 5 enabled · Bật / Tắt</w:t>
+            </w:r>
+          </w:p>
+        </w:tc>
+        <w:tc>
+          <w:p>
+            <w:r>
+              <w:t>Tắt</w:t>
+            </w:r>
+          </w:p>
+        </w:tc>
+        <w:tc>
+          <w:p>
+            <w:r>
+              <w:t>Giá trị: ______; Nguồn/trang: ______</w:t>
+            </w:r>
+          </w:p>
+        </w:tc>
+      </w:tr>
+      <w:tr>
+        <w:tc>
+          <w:p>
+            <w:r>
+              <w:t>RMS current limit 6 enabled · Bật / Tắt</w:t>
+            </w:r>
+          </w:p>
+        </w:tc>
+        <w:tc>
+          <w:p>
+            <w:r>
+              <w:t>Tắt</w:t>
+            </w:r>
+          </w:p>
+        </w:tc>
+        <w:tc>
+          <w:p>
+            <w:r>
+              <w:t>Giá trị: ______; Nguồn/trang: ______</w:t>
+            </w:r>
+          </w:p>
+        </w:tc>
+      </w:tr>
+      <w:tr>
+        <w:tc>
+          <w:p>
+            <w:r>
+              <w:t>RMS temperature limit 1 enabled · Bật / Tắt</w:t>
+            </w:r>
+          </w:p>
+        </w:tc>
+        <w:tc>
+          <w:p>
+            <w:r>
+              <w:t>Tắt</w:t>
+            </w:r>
+          </w:p>
+        </w:tc>
+        <w:tc>
+          <w:p>
+            <w:r>
+              <w:t>Giá trị: ______; Nguồn/trang: ______</w:t>
+            </w:r>
+          </w:p>
+        </w:tc>
+      </w:tr>
+      <w:tr>
+        <w:tc>
+          <w:p>
+            <w:r>
+              <w:t>RMS temperature limit 2 enabled · Bật / Tắt</w:t>
+            </w:r>
+          </w:p>
+        </w:tc>
+        <w:tc>
+          <w:p>
+            <w:r>
+              <w:t>Tắt</w:t>
+            </w:r>
+          </w:p>
+        </w:tc>
+        <w:tc>
+          <w:p>
+            <w:r>
+              <w:t>Giá trị: ______; Nguồn/trang: ______</w:t>
+            </w:r>
+          </w:p>
+        </w:tc>
+      </w:tr>
+      <w:tr>
+        <w:tc>
+          <w:p>
+            <w:r>
+              <w:t>RMS temperature limit 3 enabled · Bật / Tắt</w:t>
+            </w:r>
+          </w:p>
+        </w:tc>
+        <w:tc>
+          <w:p>
+            <w:r>
+              <w:t>Tắt</w:t>
+            </w:r>
+          </w:p>
+        </w:tc>
+        <w:tc>
+          <w:p>
+            <w:r>
+              <w:t>Giá trị: ______; Nguồn/trang: ______</w:t>
+            </w:r>
+          </w:p>
+        </w:tc>
+      </w:tr>
+      <w:tr>
+        <w:tc>
+          <w:p>
+            <w:r>
+              <w:t>RMS temperature limit 4 enabled · Bật / Tắt</w:t>
+            </w:r>
+          </w:p>
+        </w:tc>
+        <w:tc>
+          <w:p>
+            <w:r>
+              <w:t>Tắt</w:t>
+            </w:r>
+          </w:p>
+        </w:tc>
+        <w:tc>
+          <w:p>
+            <w:r>
+              <w:t>Giá trị: ______; Nguồn/trang: ______</w:t>
+            </w:r>
+          </w:p>
+        </w:tc>
+      </w:tr>
+      <w:tr>
+        <w:tc>
+          <w:p>
+            <w:r>
+              <w:t>RMS temperature limit 5 enabled · Bật / Tắt</w:t>
+            </w:r>
+          </w:p>
+        </w:tc>
+        <w:tc>
+          <w:p>
+            <w:r>
+              <w:t>Tắt</w:t>
+            </w:r>
+          </w:p>
+        </w:tc>
+        <w:tc>
+          <w:p>
+            <w:r>
+              <w:t>Giá trị: ______; Nguồn/trang: ______</w:t>
+            </w:r>
+          </w:p>
+        </w:tc>
+      </w:tr>
+      <w:tr>
+        <w:tc>
+          <w:p>
+            <w:r>
+              <w:t>RMS temperature limit 6 enabled · Bật / Tắt</w:t>
+            </w:r>
+          </w:p>
+        </w:tc>
+        <w:tc>
+          <w:p>
+            <w:r>
+              <w:t>Tắt</w:t>
+            </w:r>
+          </w:p>
+        </w:tc>
+        <w:tc>
+          <w:p>
+            <w:r>
+              <w:t>Giá trị: ______; Nguồn/trang: ______</w:t>
+            </w:r>
+          </w:p>
+        </w:tc>
+      </w:tr>
+      <w:tr>
+        <w:tc>
+          <w:p>
+            <w:r>
+              <w:t>RMS A/D limit 1 enabled · Bật / Tắt</w:t>
+            </w:r>
+          </w:p>
+        </w:tc>
+        <w:tc>
+          <w:p>
+            <w:r>
+              <w:t>Tắt</w:t>
+            </w:r>
+          </w:p>
+        </w:tc>
+        <w:tc>
+          <w:p>
+            <w:r>
+              <w:t>Giá trị: ______; Nguồn/trang: ______</w:t>
+            </w:r>
+          </w:p>
+        </w:tc>
+      </w:tr>
+      <w:tr>
+        <w:tc>
+          <w:p>
+            <w:r>
+              <w:t>RMS A/D limit 2 enabled · Bật / Tắt</w:t>
+            </w:r>
+          </w:p>
+        </w:tc>
+        <w:tc>
+          <w:p>
+            <w:r>
+              <w:t>Tắt</w:t>
+            </w:r>
+          </w:p>
+        </w:tc>
+        <w:tc>
+          <w:p>
+            <w:r>
+              <w:t>Giá trị: ______; Nguồn/trang: ______</w:t>
+            </w:r>
+          </w:p>
+        </w:tc>
+      </w:tr>
+      <w:tr>
+        <w:tc>
+          <w:p>
+            <w:r>
+              <w:t>RMS A/D limit 3 enabled · Bật / Tắt</w:t>
+            </w:r>
+          </w:p>
+        </w:tc>
+        <w:tc>
+          <w:p>
+            <w:r>
+              <w:t>Tắt</w:t>
+            </w:r>
+          </w:p>
+        </w:tc>
+        <w:tc>
+          <w:p>
+            <w:r>
+              <w:t>Giá trị: ______; Nguồn/trang: ______</w:t>
+            </w:r>
+          </w:p>
+        </w:tc>
+      </w:tr>
+      <w:tr>
+        <w:tc>
+          <w:p>
+            <w:r>
+              <w:t>RMS A/D limit 4 enabled · Bật / Tắt</w:t>
+            </w:r>
+          </w:p>
+        </w:tc>
+        <w:tc>
+          <w:p>
+            <w:r>
+              <w:t>Tắt</w:t>
+            </w:r>
+          </w:p>
+        </w:tc>
+        <w:tc>
+          <w:p>
+            <w:r>
+              <w:t>Giá trị: ______; Nguồn/trang: ______</w:t>
+            </w:r>
+          </w:p>
+        </w:tc>
+      </w:tr>
+      <w:tr>
+        <w:tc>
+          <w:p>
+            <w:r>
+              <w:t>RMS A/D limit 5 enabled · Bật / Tắt</w:t>
+            </w:r>
+          </w:p>
+        </w:tc>
+        <w:tc>
+          <w:p>
+            <w:r>
+              <w:t>Tắt</w:t>
+            </w:r>
+          </w:p>
+        </w:tc>
+        <w:tc>
+          <w:p>
+            <w:r>
+              <w:t>Giá trị: ______; Nguồn/trang: ______</w:t>
+            </w:r>
+          </w:p>
+        </w:tc>
+      </w:tr>
+      <w:tr>
+        <w:tc>
+          <w:p>
+            <w:r>
+              <w:t>RMS A/D limit 6 enabled · Bật / Tắt</w:t>
+            </w:r>
+          </w:p>
+        </w:tc>
+        <w:tc>
+          <w:p>
+            <w:r>
+              <w:t>Tắt</w:t>
+            </w:r>
+          </w:p>
+        </w:tc>
+        <w:tc>
+          <w:p>
+            <w:r>
+              <w:t>Giá trị: ______; Nguồn/trang: ______</w:t>
+            </w:r>
+          </w:p>
+        </w:tc>
+      </w:tr>
+      <w:tr>
+        <w:tc>
+          <w:p>
+            <w:r>
+              <w:t>RMS A/D limit 7 enabled · Bật / Tắt</w:t>
+            </w:r>
+          </w:p>
+        </w:tc>
+        <w:tc>
+          <w:p>
+            <w:r>
+              <w:t>Tắt</w:t>
+            </w:r>
+          </w:p>
+        </w:tc>
+        <w:tc>
+          <w:p>
+            <w:r>
+              <w:t>Giá trị: ______; Nguồn/trang: ______</w:t>
+            </w:r>
+          </w:p>
+        </w:tc>
+      </w:tr>
+      <w:tr>
+        <w:tc>
+          <w:p>
+            <w:r>
+              <w:t>RMS A/D limit 8 enabled · Bật / Tắt</w:t>
+            </w:r>
+          </w:p>
+        </w:tc>
+        <w:tc>
+          <w:p>
+            <w:r>
+              <w:t>Tắt</w:t>
+            </w:r>
+          </w:p>
+        </w:tc>
+        <w:tc>
+          <w:p>
+            <w:r>
+              <w:t>Giá trị: ______; Nguồn/trang: ______</w:t>
+            </w:r>
+          </w:p>
+        </w:tc>
+      </w:tr>
+      <w:tr>
+        <w:tc>
+          <w:p>
+            <w:r>
+              <w:t>RMS A/D limit 9 enabled · Bật / Tắt</w:t>
+            </w:r>
+          </w:p>
+        </w:tc>
+        <w:tc>
+          <w:p>
+            <w:r>
+              <w:t>Tắt</w:t>
+            </w:r>
+          </w:p>
+        </w:tc>
+        <w:tc>
+          <w:p>
+            <w:r>
+              <w:t>Giá trị: ______; Nguồn/trang: ______</w:t>
+            </w:r>
+          </w:p>
+        </w:tc>
+      </w:tr>
+      <w:tr>
+        <w:tc>
+          <w:p>
+            <w:r>
+              <w:t>RMS A/D limit 10 enabled · Bật / Tắt</w:t>
+            </w:r>
+          </w:p>
+        </w:tc>
+        <w:tc>
+          <w:p>
+            <w:r>
+              <w:t>Tắt</w:t>
+            </w:r>
+          </w:p>
+        </w:tc>
+        <w:tc>
+          <w:p>
+            <w:r>
+              <w:t>Giá trị: ______; Nguồn/trang: ______</w:t>
+            </w:r>
+          </w:p>
+        </w:tc>
+      </w:tr>
+    </w:tbl>
+    <w:p>
+      <w:pPr>
+        <w:pStyle w:val="Heading2"/>
+      </w:pPr>
+      <w:r>
         <w:t>Monitor executive alarms</w:t>
       </w:r>
     </w:p>
@@ -3013,6 +3929,807 @@
           <w:p>
             <w:r>
               <w:t>0</w:t>
+            </w:r>
+          </w:p>
+        </w:tc>
+        <w:tc>
+          <w:p>
+            <w:r>
+              <w:t>Giá trị: ______; Nguồn/trang: ______</w:t>
+            </w:r>
+          </w:p>
+        </w:tc>
+      </w:tr>
+    </w:tbl>
+    <w:p>
+      <w:pPr>
+        <w:pStyle w:val="Heading2"/>
+      </w:pPr>
+      <w:r>
+        <w:t>Monitor offsets</w:t>
+      </w:r>
+    </w:p>
+    <w:tbl>
+      <w:tblPr>
+        <w:tblStyle w:val="TableGrid"/>
+        <w:tblW w:type="auto" w:w="0"/>
+        <w:tblLayout w:type="fixed"/>
+        <w:tblLook w:firstColumn="1" w:firstRow="1" w:lastColumn="0" w:lastRow="0" w:noHBand="0" w:noVBand="1" w:val="04A0"/>
+      </w:tblPr>
+      <w:tblGrid>
+        <w:gridCol w:w="5472"/>
+        <w:gridCol w:w="1656"/>
+        <w:gridCol w:w="2736"/>
+      </w:tblGrid>
+      <w:tr>
+        <w:trPr>
+          <w:tblHeader/>
+        </w:trPr>
+        <w:tc>
+          <w:tcPr>
+            <w:tcW w:type="dxa" w:w="5472"/>
+          </w:tcPr>
+          <w:p>
+            <w:r>
+              <w:rPr>
+                <w:b/>
+              </w:rPr>
+              <w:t>Thông số / đơn vị / giới hạn</w:t>
+            </w:r>
+          </w:p>
+        </w:tc>
+        <w:tc>
+          <w:tcPr>
+            <w:tcW w:type="dxa" w:w="1656"/>
+          </w:tcPr>
+          <w:p>
+            <w:r>
+              <w:rPr>
+                <w:b/>
+              </w:rPr>
+              <w:t>Mặc định mô phỏng</w:t>
+            </w:r>
+          </w:p>
+        </w:tc>
+        <w:tc>
+          <w:tcPr>
+            <w:tcW w:type="dxa" w:w="2736"/>
+          </w:tcPr>
+          <w:p>
+            <w:r>
+              <w:rPr>
+                <w:b/>
+              </w:rPr>
+              <w:t>Giá trị tài liệu / Nguồn/trang</w:t>
+            </w:r>
+          </w:p>
+        </w:tc>
+      </w:tr>
+      <w:tr>
+        <w:tc>
+          <w:p>
+            <w:r>
+              <w:t>Monitor 1 integral Delay Offset · Đơn vị: us · ≥ -100 · ≤ 100</w:t>
+            </w:r>
+          </w:p>
+        </w:tc>
+        <w:tc>
+          <w:p>
+            <w:r>
+              <w:t>0</w:t>
+            </w:r>
+          </w:p>
+        </w:tc>
+        <w:tc>
+          <w:p>
+            <w:r>
+              <w:t>Giá trị: ______; Nguồn/trang: ______</w:t>
+            </w:r>
+          </w:p>
+        </w:tc>
+      </w:tr>
+      <w:tr>
+        <w:tc>
+          <w:p>
+            <w:r>
+              <w:t>Monitor 1 standby Delay Offset · Đơn vị: us · ≥ -100 · ≤ 100</w:t>
+            </w:r>
+          </w:p>
+        </w:tc>
+        <w:tc>
+          <w:p>
+            <w:r>
+              <w:t>0</w:t>
+            </w:r>
+          </w:p>
+        </w:tc>
+        <w:tc>
+          <w:p>
+            <w:r>
+              <w:t>Giá trị: ______; Nguồn/trang: ______</w:t>
+            </w:r>
+          </w:p>
+        </w:tc>
+      </w:tr>
+      <w:tr>
+        <w:tc>
+          <w:p>
+            <w:r>
+              <w:t>Monitor 1 integral Spacing Offset · Đơn vị: us · ≥ -100 · ≤ 100</w:t>
+            </w:r>
+          </w:p>
+        </w:tc>
+        <w:tc>
+          <w:p>
+            <w:r>
+              <w:t>0</w:t>
+            </w:r>
+          </w:p>
+        </w:tc>
+        <w:tc>
+          <w:p>
+            <w:r>
+              <w:t>Giá trị: ______; Nguồn/trang: ______</w:t>
+            </w:r>
+          </w:p>
+        </w:tc>
+      </w:tr>
+      <w:tr>
+        <w:tc>
+          <w:p>
+            <w:r>
+              <w:t>Monitor 1 standby Spacing Offset · Đơn vị: us · ≥ -100 · ≤ 100</w:t>
+            </w:r>
+          </w:p>
+        </w:tc>
+        <w:tc>
+          <w:p>
+            <w:r>
+              <w:t>0</w:t>
+            </w:r>
+          </w:p>
+        </w:tc>
+        <w:tc>
+          <w:p>
+            <w:r>
+              <w:t>Giá trị: ______; Nguồn/trang: ______</w:t>
+            </w:r>
+          </w:p>
+        </w:tc>
+      </w:tr>
+      <w:tr>
+        <w:tc>
+          <w:p>
+            <w:r>
+              <w:t>Monitor 1 standby Tx Power Scale · Đơn vị: % · ≥ 0 · ≤ 300</w:t>
+            </w:r>
+          </w:p>
+        </w:tc>
+        <w:tc>
+          <w:p>
+            <w:r>
+              <w:t>175</w:t>
+            </w:r>
+          </w:p>
+        </w:tc>
+        <w:tc>
+          <w:p>
+            <w:r>
+              <w:t>Giá trị: ______; Nguồn/trang: ______</w:t>
+            </w:r>
+          </w:p>
+        </w:tc>
+      </w:tr>
+      <w:tr>
+        <w:tc>
+          <w:p>
+            <w:r>
+              <w:t>Monitor 1 standby Tx Power Offset · Đơn vị: Watts · ≥ -5000 · ≤ 5000</w:t>
+            </w:r>
+          </w:p>
+        </w:tc>
+        <w:tc>
+          <w:p>
+            <w:r>
+              <w:t>0</w:t>
+            </w:r>
+          </w:p>
+        </w:tc>
+        <w:tc>
+          <w:p>
+            <w:r>
+              <w:t>Giá trị: ______; Nguồn/trang: ______</w:t>
+            </w:r>
+          </w:p>
+        </w:tc>
+      </w:tr>
+      <w:tr>
+        <w:tc>
+          <w:p>
+            <w:r>
+              <w:t>Monitor 1 integral Efficiency Offset · Đơn vị: % · ≥ -100 · ≤ 100</w:t>
+            </w:r>
+          </w:p>
+        </w:tc>
+        <w:tc>
+          <w:p>
+            <w:r>
+              <w:t>0</w:t>
+            </w:r>
+          </w:p>
+        </w:tc>
+        <w:tc>
+          <w:p>
+            <w:r>
+              <w:t>Giá trị: ______; Nguồn/trang: ______</w:t>
+            </w:r>
+          </w:p>
+        </w:tc>
+      </w:tr>
+      <w:tr>
+        <w:tc>
+          <w:p>
+            <w:r>
+              <w:t>Monitor 1 standby Efficiency Offset · Đơn vị: % · ≥ -100 · ≤ 100</w:t>
+            </w:r>
+          </w:p>
+        </w:tc>
+        <w:tc>
+          <w:p>
+            <w:r>
+              <w:t>0</w:t>
+            </w:r>
+          </w:p>
+        </w:tc>
+        <w:tc>
+          <w:p>
+            <w:r>
+              <w:t>Giá trị: ______; Nguồn/trang: ______</w:t>
+            </w:r>
+          </w:p>
+        </w:tc>
+      </w:tr>
+      <w:tr>
+        <w:tc>
+          <w:p>
+            <w:r>
+              <w:t>Monitor 1 integral PRF Offset · Đơn vị: ppps · ≥ -6000 · ≤ 6000</w:t>
+            </w:r>
+          </w:p>
+        </w:tc>
+        <w:tc>
+          <w:p>
+            <w:r>
+              <w:t>0</w:t>
+            </w:r>
+          </w:p>
+        </w:tc>
+        <w:tc>
+          <w:p>
+            <w:r>
+              <w:t>Giá trị: ______; Nguồn/trang: ______</w:t>
+            </w:r>
+          </w:p>
+        </w:tc>
+      </w:tr>
+      <w:tr>
+        <w:tc>
+          <w:p>
+            <w:r>
+              <w:t>Monitor 1 standby PRF Offset · Đơn vị: ppps · ≥ -6000 · ≤ 6000</w:t>
+            </w:r>
+          </w:p>
+        </w:tc>
+        <w:tc>
+          <w:p>
+            <w:r>
+              <w:t>0</w:t>
+            </w:r>
+          </w:p>
+        </w:tc>
+        <w:tc>
+          <w:p>
+            <w:r>
+              <w:t>Giá trị: ______; Nguồn/trang: ______</w:t>
+            </w:r>
+          </w:p>
+        </w:tc>
+      </w:tr>
+      <w:tr>
+        <w:tc>
+          <w:p>
+            <w:r>
+              <w:t>Monitor 1 integral Tx Frequency Offset · Đơn vị: ppm · ≥ -1000 · ≤ 1000</w:t>
+            </w:r>
+          </w:p>
+        </w:tc>
+        <w:tc>
+          <w:p>
+            <w:r>
+              <w:t>0</w:t>
+            </w:r>
+          </w:p>
+        </w:tc>
+        <w:tc>
+          <w:p>
+            <w:r>
+              <w:t>Giá trị: ______; Nguồn/trang: ______</w:t>
+            </w:r>
+          </w:p>
+        </w:tc>
+      </w:tr>
+      <w:tr>
+        <w:tc>
+          <w:p>
+            <w:r>
+              <w:t>Monitor 1 standby Tx Frequency Offset · Đơn vị: ppm · ≥ -1000 · ≤ 1000</w:t>
+            </w:r>
+          </w:p>
+        </w:tc>
+        <w:tc>
+          <w:p>
+            <w:r>
+              <w:t>0</w:t>
+            </w:r>
+          </w:p>
+        </w:tc>
+        <w:tc>
+          <w:p>
+            <w:r>
+              <w:t>Giá trị: ______; Nguồn/trang: ______</w:t>
+            </w:r>
+          </w:p>
+        </w:tc>
+      </w:tr>
+      <w:tr>
+        <w:tc>
+          <w:p>
+            <w:r>
+              <w:t>Monitor 1 integral Rx Frequency Offset · Đơn vị: ppm · ≥ -1000 · ≤ 1000</w:t>
+            </w:r>
+          </w:p>
+        </w:tc>
+        <w:tc>
+          <w:p>
+            <w:r>
+              <w:t>10</w:t>
+            </w:r>
+          </w:p>
+        </w:tc>
+        <w:tc>
+          <w:p>
+            <w:r>
+              <w:t>Giá trị: ______; Nguồn/trang: ______</w:t>
+            </w:r>
+          </w:p>
+        </w:tc>
+      </w:tr>
+      <w:tr>
+        <w:tc>
+          <w:p>
+            <w:r>
+              <w:t>Monitor 1 standby Rx Frequency Offset · Đơn vị: ppm · ≥ -1000 · ≤ 1000</w:t>
+            </w:r>
+          </w:p>
+        </w:tc>
+        <w:tc>
+          <w:p>
+            <w:r>
+              <w:t>10</w:t>
+            </w:r>
+          </w:p>
+        </w:tc>
+        <w:tc>
+          <w:p>
+            <w:r>
+              <w:t>Giá trị: ______; Nguồn/trang: ______</w:t>
+            </w:r>
+          </w:p>
+        </w:tc>
+      </w:tr>
+      <w:tr>
+        <w:tc>
+          <w:p>
+            <w:r>
+              <w:t>Monitor 1 integral ERP Offset · Đơn vị: dB · ≥ -100 · ≤ 100</w:t>
+            </w:r>
+          </w:p>
+        </w:tc>
+        <w:tc>
+          <w:p>
+            <w:r>
+              <w:t>0.3</w:t>
+            </w:r>
+          </w:p>
+        </w:tc>
+        <w:tc>
+          <w:p>
+            <w:r>
+              <w:t>Giá trị: ______; Nguồn/trang: ______</w:t>
+            </w:r>
+          </w:p>
+        </w:tc>
+      </w:tr>
+      <w:tr>
+        <w:tc>
+          <w:p>
+            <w:r>
+              <w:t>Monitor 1 integral Return Loss Offset · Đơn vị: dB · ≥ -100 · ≤ 100</w:t>
+            </w:r>
+          </w:p>
+        </w:tc>
+        <w:tc>
+          <w:p>
+            <w:r>
+              <w:t>-0.4</w:t>
+            </w:r>
+          </w:p>
+        </w:tc>
+        <w:tc>
+          <w:p>
+            <w:r>
+              <w:t>Giá trị: ______; Nguồn/trang: ______</w:t>
+            </w:r>
+          </w:p>
+        </w:tc>
+      </w:tr>
+      <w:tr>
+        <w:tc>
+          <w:p>
+            <w:r>
+              <w:t>Monitor 2 integral Delay Offset · Đơn vị: us · ≥ -100 · ≤ 100</w:t>
+            </w:r>
+          </w:p>
+        </w:tc>
+        <w:tc>
+          <w:p>
+            <w:r>
+              <w:t>0</w:t>
+            </w:r>
+          </w:p>
+        </w:tc>
+        <w:tc>
+          <w:p>
+            <w:r>
+              <w:t>Giá trị: ______; Nguồn/trang: ______</w:t>
+            </w:r>
+          </w:p>
+        </w:tc>
+      </w:tr>
+      <w:tr>
+        <w:tc>
+          <w:p>
+            <w:r>
+              <w:t>Monitor 2 standby Delay Offset · Đơn vị: us · ≥ -100 · ≤ 100</w:t>
+            </w:r>
+          </w:p>
+        </w:tc>
+        <w:tc>
+          <w:p>
+            <w:r>
+              <w:t>0</w:t>
+            </w:r>
+          </w:p>
+        </w:tc>
+        <w:tc>
+          <w:p>
+            <w:r>
+              <w:t>Giá trị: ______; Nguồn/trang: ______</w:t>
+            </w:r>
+          </w:p>
+        </w:tc>
+      </w:tr>
+      <w:tr>
+        <w:tc>
+          <w:p>
+            <w:r>
+              <w:t>Monitor 2 integral Spacing Offset · Đơn vị: us · ≥ -100 · ≤ 100</w:t>
+            </w:r>
+          </w:p>
+        </w:tc>
+        <w:tc>
+          <w:p>
+            <w:r>
+              <w:t>0</w:t>
+            </w:r>
+          </w:p>
+        </w:tc>
+        <w:tc>
+          <w:p>
+            <w:r>
+              <w:t>Giá trị: ______; Nguồn/trang: ______</w:t>
+            </w:r>
+          </w:p>
+        </w:tc>
+      </w:tr>
+      <w:tr>
+        <w:tc>
+          <w:p>
+            <w:r>
+              <w:t>Monitor 2 standby Spacing Offset · Đơn vị: us · ≥ -100 · ≤ 100</w:t>
+            </w:r>
+          </w:p>
+        </w:tc>
+        <w:tc>
+          <w:p>
+            <w:r>
+              <w:t>0</w:t>
+            </w:r>
+          </w:p>
+        </w:tc>
+        <w:tc>
+          <w:p>
+            <w:r>
+              <w:t>Giá trị: ______; Nguồn/trang: ______</w:t>
+            </w:r>
+          </w:p>
+        </w:tc>
+      </w:tr>
+      <w:tr>
+        <w:tc>
+          <w:p>
+            <w:r>
+              <w:t>Monitor 2 standby Tx Power Scale · Đơn vị: % · ≥ 0 · ≤ 300</w:t>
+            </w:r>
+          </w:p>
+        </w:tc>
+        <w:tc>
+          <w:p>
+            <w:r>
+              <w:t>175</w:t>
+            </w:r>
+          </w:p>
+        </w:tc>
+        <w:tc>
+          <w:p>
+            <w:r>
+              <w:t>Giá trị: ______; Nguồn/trang: ______</w:t>
+            </w:r>
+          </w:p>
+        </w:tc>
+      </w:tr>
+      <w:tr>
+        <w:tc>
+          <w:p>
+            <w:r>
+              <w:t>Monitor 2 standby Tx Power Offset · Đơn vị: Watts · ≥ -5000 · ≤ 5000</w:t>
+            </w:r>
+          </w:p>
+        </w:tc>
+        <w:tc>
+          <w:p>
+            <w:r>
+              <w:t>0</w:t>
+            </w:r>
+          </w:p>
+        </w:tc>
+        <w:tc>
+          <w:p>
+            <w:r>
+              <w:t>Giá trị: ______; Nguồn/trang: ______</w:t>
+            </w:r>
+          </w:p>
+        </w:tc>
+      </w:tr>
+      <w:tr>
+        <w:tc>
+          <w:p>
+            <w:r>
+              <w:t>Monitor 2 integral Efficiency Offset · Đơn vị: % · ≥ -100 · ≤ 100</w:t>
+            </w:r>
+          </w:p>
+        </w:tc>
+        <w:tc>
+          <w:p>
+            <w:r>
+              <w:t>0</w:t>
+            </w:r>
+          </w:p>
+        </w:tc>
+        <w:tc>
+          <w:p>
+            <w:r>
+              <w:t>Giá trị: ______; Nguồn/trang: ______</w:t>
+            </w:r>
+          </w:p>
+        </w:tc>
+      </w:tr>
+      <w:tr>
+        <w:tc>
+          <w:p>
+            <w:r>
+              <w:t>Monitor 2 standby Efficiency Offset · Đơn vị: % · ≥ -100 · ≤ 100</w:t>
+            </w:r>
+          </w:p>
+        </w:tc>
+        <w:tc>
+          <w:p>
+            <w:r>
+              <w:t>0</w:t>
+            </w:r>
+          </w:p>
+        </w:tc>
+        <w:tc>
+          <w:p>
+            <w:r>
+              <w:t>Giá trị: ______; Nguồn/trang: ______</w:t>
+            </w:r>
+          </w:p>
+        </w:tc>
+      </w:tr>
+      <w:tr>
+        <w:tc>
+          <w:p>
+            <w:r>
+              <w:t>Monitor 2 integral PRF Offset · Đơn vị: ppps · ≥ -6000 · ≤ 6000</w:t>
+            </w:r>
+          </w:p>
+        </w:tc>
+        <w:tc>
+          <w:p>
+            <w:r>
+              <w:t>0</w:t>
+            </w:r>
+          </w:p>
+        </w:tc>
+        <w:tc>
+          <w:p>
+            <w:r>
+              <w:t>Giá trị: ______; Nguồn/trang: ______</w:t>
+            </w:r>
+          </w:p>
+        </w:tc>
+      </w:tr>
+      <w:tr>
+        <w:tc>
+          <w:p>
+            <w:r>
+              <w:t>Monitor 2 standby PRF Offset · Đơn vị: ppps · ≥ -6000 · ≤ 6000</w:t>
+            </w:r>
+          </w:p>
+        </w:tc>
+        <w:tc>
+          <w:p>
+            <w:r>
+              <w:t>0</w:t>
+            </w:r>
+          </w:p>
+        </w:tc>
+        <w:tc>
+          <w:p>
+            <w:r>
+              <w:t>Giá trị: ______; Nguồn/trang: ______</w:t>
+            </w:r>
+          </w:p>
+        </w:tc>
+      </w:tr>
+      <w:tr>
+        <w:tc>
+          <w:p>
+            <w:r>
+              <w:t>Monitor 2 integral Tx Frequency Offset · Đơn vị: ppm · ≥ -1000 · ≤ 1000</w:t>
+            </w:r>
+          </w:p>
+        </w:tc>
+        <w:tc>
+          <w:p>
+            <w:r>
+              <w:t>0</w:t>
+            </w:r>
+          </w:p>
+        </w:tc>
+        <w:tc>
+          <w:p>
+            <w:r>
+              <w:t>Giá trị: ______; Nguồn/trang: ______</w:t>
+            </w:r>
+          </w:p>
+        </w:tc>
+      </w:tr>
+      <w:tr>
+        <w:tc>
+          <w:p>
+            <w:r>
+              <w:t>Monitor 2 standby Tx Frequency Offset · Đơn vị: ppm · ≥ -1000 · ≤ 1000</w:t>
+            </w:r>
+          </w:p>
+        </w:tc>
+        <w:tc>
+          <w:p>
+            <w:r>
+              <w:t>0</w:t>
+            </w:r>
+          </w:p>
+        </w:tc>
+        <w:tc>
+          <w:p>
+            <w:r>
+              <w:t>Giá trị: ______; Nguồn/trang: ______</w:t>
+            </w:r>
+          </w:p>
+        </w:tc>
+      </w:tr>
+      <w:tr>
+        <w:tc>
+          <w:p>
+            <w:r>
+              <w:t>Monitor 2 integral Rx Frequency Offset · Đơn vị: ppm · ≥ -1000 · ≤ 1000</w:t>
+            </w:r>
+          </w:p>
+        </w:tc>
+        <w:tc>
+          <w:p>
+            <w:r>
+              <w:t>10</w:t>
+            </w:r>
+          </w:p>
+        </w:tc>
+        <w:tc>
+          <w:p>
+            <w:r>
+              <w:t>Giá trị: ______; Nguồn/trang: ______</w:t>
+            </w:r>
+          </w:p>
+        </w:tc>
+      </w:tr>
+      <w:tr>
+        <w:tc>
+          <w:p>
+            <w:r>
+              <w:t>Monitor 2 standby Rx Frequency Offset · Đơn vị: ppm · ≥ -1000 · ≤ 1000</w:t>
+            </w:r>
+          </w:p>
+        </w:tc>
+        <w:tc>
+          <w:p>
+            <w:r>
+              <w:t>10</w:t>
+            </w:r>
+          </w:p>
+        </w:tc>
+        <w:tc>
+          <w:p>
+            <w:r>
+              <w:t>Giá trị: ______; Nguồn/trang: ______</w:t>
+            </w:r>
+          </w:p>
+        </w:tc>
+      </w:tr>
+      <w:tr>
+        <w:tc>
+          <w:p>
+            <w:r>
+              <w:t>Monitor 2 integral ERP Offset · Đơn vị: dB · ≥ -100 · ≤ 100</w:t>
+            </w:r>
+          </w:p>
+        </w:tc>
+        <w:tc>
+          <w:p>
+            <w:r>
+              <w:t>0.3</w:t>
+            </w:r>
+          </w:p>
+        </w:tc>
+        <w:tc>
+          <w:p>
+            <w:r>
+              <w:t>Giá trị: ______; Nguồn/trang: ______</w:t>
+            </w:r>
+          </w:p>
+        </w:tc>
+      </w:tr>
+      <w:tr>
+        <w:tc>
+          <w:p>
+            <w:r>
+              <w:t>Monitor 2 integral Return Loss Offset · Đơn vị: dB · ≥ -100 · ≤ 100</w:t>
+            </w:r>
+          </w:p>
+        </w:tc>
+        <w:tc>
+          <w:p>
+            <w:r>
+              <w:t>-0.4</w:t>
             </w:r>
           </w:p>
         </w:tc>

</xml_diff>